<commit_message>
Tugas Pertemuan ke 4
</commit_message>
<xml_diff>
--- a/Pertemuan 1/Ardiansah_Nur_Rohman_230322607922_Tugas_1_PJJ.docx
+++ b/Pertemuan 1/Ardiansah_Nur_Rohman_230322607922_Tugas_1_PJJ.docx
@@ -117,7 +117,7 @@
         <w:rPr>
           <w:highlight w:val="none"/>
         </w:rPr>
-        <w:t xml:space="preserve">Wilayah</w:t>
+        <w:t xml:space="preserve">Wilayah Malang</w:t>
       </w:r>
       <w:r>
         <w:rPr>
@@ -237,7 +237,7 @@
         <w:rPr>
           <w:highlight w:val="none"/>
         </w:rPr>
-        <w:t xml:space="preserve">Batas Wilayah</w:t>
+        <w:t xml:space="preserve">Batas Wilayah Malang</w:t>
       </w:r>
       <w:r>
         <w:rPr>
@@ -363,6 +363,7 @@
         <w:rPr>
           <w:highlight w:val="none"/>
         </w:rPr>
+        <w:t xml:space="preserve">Malang</w:t>
       </w:r>
       <w:r/>
     </w:p>
@@ -497,7 +498,7 @@
         <w:rPr>
           <w:highlight w:val="none"/>
         </w:rPr>
-        <w:t xml:space="preserve">Wilayah</w:t>
+        <w:t xml:space="preserve">Wilayah Surabaya</w:t>
       </w:r>
       <w:r>
         <w:rPr>
@@ -619,7 +620,9 @@
         </w:rPr>
         <w:t xml:space="preserve">Batas Wilayah</w:t>
       </w:r>
-      <w:r/>
+      <w:r>
+        <w:t xml:space="preserve"> Surabaya</w:t>
+      </w:r>
       <w:r>
         <w:rPr>
           <w:highlight w:val="none"/>
@@ -738,7 +741,7 @@
         <w:rPr>
           <w:highlight w:val="none"/>
         </w:rPr>
-        <w:t xml:space="preserve">Gabungan</w:t>
+        <w:t xml:space="preserve">Gabungan Surabaya</w:t>
       </w:r>
       <w:r/>
     </w:p>
@@ -749,11 +752,6 @@
         <w:ind w:firstLine="0" w:left="709"/>
         <w:rPr/>
       </w:pPr>
-      <w:r>
-        <w:rPr>
-          <w:highlight w:val="none"/>
-        </w:rPr>
-      </w:r>
       <w:r>
         <w:rPr>
           <w:highlight w:val="none"/>
@@ -774,7 +772,7 @@
                   <a:graphicData uri="http://schemas.openxmlformats.org/drawingml/2006/picture">
                     <pic:pic xmlns:pic="http://schemas.openxmlformats.org/drawingml/2006/picture">
                       <pic:nvPicPr>
-                        <pic:cNvPr id="1631339730" name=""/>
+                        <pic:cNvPr id="1541656061" name=""/>
                         <pic:cNvPicPr>
                           <a:picLocks noChangeAspect="1"/>
                         </pic:cNvPicPr>
@@ -828,6 +826,17 @@
           </mc:Fallback>
         </mc:AlternateContent>
       </w:r>
+      <w:r>
+        <w:rPr>
+          <w:highlight w:val="none"/>
+        </w:rPr>
+      </w:r>
+      <w:r>
+        <w:rPr>
+          <w:highlight w:val="none"/>
+        </w:rPr>
+      </w:r>
+      <w:r/>
       <w:r>
         <w:rPr>
           <w:highlight w:val="none"/>

</xml_diff>